<commit_message>
Polish CO2 supplementary table index
</commit_message>
<xml_diff>
--- a/docs/manuscript_development/CO2_SUPPLEMENTARY_TABLES_INDEX.docx
+++ b/docs/manuscript_development/CO2_SUPPLEMENTARY_TABLES_INDEX.docx
@@ -17,7 +17,7 @@
     </w:p>
     <w:p>
       <w:r>
-        <w:t>Draft status: source-backed index for the supplement. This is not a formatted journal supplement yet.</w:t>
+        <w:t>Draft status: journal-facing supplement index for coauthor review. The table contents are source-backed, but final journal captions, workbook tab names, and file naming should be adjusted after the target journal is chosen.</w:t>
       </w:r>
     </w:p>
     <w:p>
@@ -25,7 +25,7 @@
         <w:pStyle w:val="Heading1"/>
       </w:pPr>
       <w:r>
-        <w:t>Generated or available tables</w:t>
+        <w:t>Supplementary Table Plan</w:t>
       </w:r>
     </w:p>
     <w:tbl>
@@ -56,7 +56,7 @@
           </w:tcPr>
           <w:p>
             <w:r>
-              <w:t>Table</w:t>
+              <w:t>Item</w:t>
             </w:r>
           </w:p>
         </w:tc>
@@ -73,7 +73,24 @@
           </w:tcPr>
           <w:p>
             <w:r>
-              <w:t>Current source</w:t>
+              <w:t>Purpose</w:t>
+            </w:r>
+          </w:p>
+        </w:tc>
+        <w:tc>
+          <w:tcPr>
+            <w:tcW w:type="dxa" w:w="2340"/>
+            <w:tcMar>
+              <w:top w:w="80" w:type="dxa"/>
+              <w:start w:w="120" w:type="dxa"/>
+              <w:bottom w:w="80" w:type="dxa"/>
+              <w:end w:w="120" w:type="dxa"/>
+            </w:tcMar>
+            <w:shd w:fill="F2F4F7"/>
+          </w:tcPr>
+          <w:p>
+            <w:r>
+              <w:t>Key columns or contents</w:t>
             </w:r>
           </w:p>
         </w:tc>
@@ -94,6 +111,8 @@
             </w:r>
           </w:p>
         </w:tc>
+      </w:tr>
+      <w:tr>
         <w:tc>
           <w:tcPr>
             <w:tcW w:type="dxa" w:w="2340"/>
@@ -103,11 +122,58 @@
               <w:bottom w:w="80" w:type="dxa"/>
               <w:end w:w="120" w:type="dxa"/>
             </w:tcMar>
-            <w:shd w:fill="F2F4F7"/>
           </w:tcPr>
           <w:p>
             <w:r>
-              <w:t>Notes</w:t>
+              <w:t>eTable 1. Cohort flow and signal availability</w:t>
+            </w:r>
+          </w:p>
+        </w:tc>
+        <w:tc>
+          <w:tcPr>
+            <w:tcW w:type="dxa" w:w="2340"/>
+            <w:tcMar>
+              <w:top w:w="80" w:type="dxa"/>
+              <w:start w:w="120" w:type="dxa"/>
+              <w:bottom w:w="80" w:type="dxa"/>
+              <w:end w:w="120" w:type="dxa"/>
+            </w:tcMar>
+          </w:tcPr>
+          <w:p>
+            <w:r>
+              <w:t>Documents patient and timestamp retention for each tissue oxygenation channel.</w:t>
+            </w:r>
+          </w:p>
+        </w:tc>
+        <w:tc>
+          <w:tcPr>
+            <w:tcW w:type="dxa" w:w="2340"/>
+            <w:tcMar>
+              <w:top w:w="80" w:type="dxa"/>
+              <w:start w:w="120" w:type="dxa"/>
+              <w:bottom w:w="80" w:type="dxa"/>
+              <w:end w:w="120" w:type="dxa"/>
+            </w:tcMar>
+          </w:tcPr>
+          <w:p>
+            <w:r>
+              <w:t>Filtering stage, tissue oxygenation channel, timestamp rows, patient counts.</w:t>
+            </w:r>
+          </w:p>
+        </w:tc>
+        <w:tc>
+          <w:tcPr>
+            <w:tcW w:type="dxa" w:w="2340"/>
+            <w:tcMar>
+              <w:top w:w="80" w:type="dxa"/>
+              <w:start w:w="120" w:type="dxa"/>
+              <w:bottom w:w="80" w:type="dxa"/>
+              <w:end w:w="120" w:type="dxa"/>
+            </w:tcMar>
+          </w:tcPr>
+          <w:p>
+            <w:r>
+              <w:t>Available locally</w:t>
             </w:r>
           </w:p>
         </w:tc>
@@ -125,7 +191,7 @@
           </w:tcPr>
           <w:p>
             <w:r>
-              <w:t>eTable 1/2. Baseline and intraoperative characteristics</w:t>
+              <w:t>eTable 2. Baseline and intraoperative characteristics</w:t>
             </w:r>
           </w:p>
         </w:tc>
@@ -141,7 +207,7 @@
           </w:tcPr>
           <w:p>
             <w:r>
-              <w:t>`docs/manuscript_development/generated_assets/supplementary_etable1_2_cohort_characteristics.xlsx` and `supplementary_etable1_2_cohort_characteristics_long.csv`; source files under `results/manuscript_tables/`</w:t>
+              <w:t>Provides the expanded cohort description behind main Table 1.</w:t>
             </w:r>
           </w:p>
         </w:tc>
@@ -157,7 +223,7 @@
           </w:tcPr>
           <w:p>
             <w:r>
-              <w:t>available locally</w:t>
+              <w:t>Cohort, characteristic, value, missing count; wide and long formats are available.</w:t>
             </w:r>
           </w:p>
         </w:tc>
@@ -173,7 +239,7 @@
           </w:tcPr>
           <w:p>
             <w:r>
-              <w:t>Generated from the local Table 1/2 workbook; includes wide, long, and flow-count sheets</w:t>
+              <w:t>Available locally</w:t>
             </w:r>
           </w:p>
         </w:tc>
@@ -191,7 +257,7 @@
           </w:tcPr>
           <w:p>
             <w:r>
-              <w:t>eTable 3. Timestamp-level artifact/outlier summaries</w:t>
+              <w:t>eTable 3. Timestamp-level artifact and outlier exclusions</w:t>
             </w:r>
           </w:p>
         </w:tc>
@@ -207,7 +273,7 @@
           </w:tcPr>
           <w:p>
             <w:r>
-              <w:t>`results/supplemental_etables/supplemental_etable3_artifact_co2_rso2.csv` and `Supplemental_eTables3_5_CO2_rSO2.xlsx`</w:t>
+              <w:t>Describes implausible EtCO2 and tissue oxygenation values removed before modeling.</w:t>
             </w:r>
           </w:p>
         </w:tc>
@@ -223,7 +289,7 @@
           </w:tcPr>
           <w:p>
             <w:r>
-              <w:t>available locally</w:t>
+              <w:t>Variable, channel, exclusion rule, excluded timestamps, retained timestamps.</w:t>
             </w:r>
           </w:p>
         </w:tc>
@@ -239,7 +305,7 @@
           </w:tcPr>
           <w:p>
             <w:r>
-              <w:t>`rSO2_Ch3` is adjudicated as SftO2 in manuscript-facing outputs; workbook title uses forearm tissue oxygenation</w:t>
+              <w:t>Available locally</w:t>
             </w:r>
           </w:p>
         </w:tc>
@@ -257,7 +323,7 @@
           </w:tcPr>
           <w:p>
             <w:r>
-              <w:t>eTable 4. Missingness and imputation of intraoperative covariates</w:t>
+              <w:t>eTable 4. Missingness and imputation of time-varying covariates</w:t>
             </w:r>
           </w:p>
         </w:tc>
@@ -273,7 +339,7 @@
           </w:tcPr>
           <w:p>
             <w:r>
-              <w:t>`results/supplemental_etables/supplemental_etable4_missingness_imputation_other_intraop.csv` and `Supplemental_eTables3_5_CO2_rSO2.xlsx`</w:t>
+              <w:t>Documents preprocessing for intraoperative covariates used in adjustment.</w:t>
             </w:r>
           </w:p>
         </w:tc>
@@ -289,7 +355,7 @@
           </w:tcPr>
           <w:p>
             <w:r>
-              <w:t>available locally</w:t>
+              <w:t>Variable, physiologic range, missing before imputation, imputation step, missing after imputation.</w:t>
             </w:r>
           </w:p>
         </w:tc>
@@ -305,7 +371,7 @@
           </w:tcPr>
           <w:p>
             <w:r>
-              <w:t>Covers TEMP, FiO2, MAP, SV, HR, and CI</w:t>
+              <w:t>Available locally</w:t>
             </w:r>
           </w:p>
         </w:tc>
@@ -323,7 +389,7 @@
           </w:tcPr>
           <w:p>
             <w:r>
-              <w:t>eTable 5. Patient-level EtCO2 and tissue oxygenation summary</w:t>
+              <w:t>eTable 5. Patient-level EtCO2 and tissue oxygenation summaries</w:t>
             </w:r>
           </w:p>
         </w:tc>
@@ -339,7 +405,7 @@
           </w:tcPr>
           <w:p>
             <w:r>
-              <w:t>`results/supplemental_etables/supplemental_etable5_patient_level_co2_rso2.csv` and `Supplemental_eTables3_5_CO2_rSO2.xlsx`</w:t>
+              <w:t>Summarizes exposure and outcome distributions at the patient level.</w:t>
             </w:r>
           </w:p>
         </w:tc>
@@ -355,7 +421,7 @@
           </w:tcPr>
           <w:p>
             <w:r>
-              <w:t>available locally</w:t>
+              <w:t>Tissue oxygenation channel, patients, observations, EtCO2 mean, rSO2 mean.</w:t>
             </w:r>
           </w:p>
         </w:tc>
@@ -371,7 +437,7 @@
           </w:tcPr>
           <w:p>
             <w:r>
-              <w:t>Reports patients, observations, mean EtCO2, and tissue oxygenation</w:t>
+              <w:t>Available locally</w:t>
             </w:r>
           </w:p>
         </w:tc>
@@ -405,7 +471,7 @@
           </w:tcPr>
           <w:p>
             <w:r>
-              <w:t>`results/supplemental_etables/supplemental_etable6_model_performance_co2_rso2.csv` and `Supplemental_eTables6_8_CO2_rSO2.xlsx`</w:t>
+              <w:t>Reports fit and complexity of the channel-specific generalized additive models.</w:t>
             </w:r>
           </w:p>
         </w:tc>
@@ -421,7 +487,7 @@
           </w:tcPr>
           <w:p>
             <w:r>
-              <w:t>available locally</w:t>
+              <w:t>Outcome, sampled rows, model features, effective degrees of freedom, deviance explained, RMSE.</w:t>
             </w:r>
           </w:p>
         </w:tc>
@@ -437,7 +503,7 @@
           </w:tcPr>
           <w:p>
             <w:r>
-              <w:t>Includes sampled rows, features, EDOF, deviance explained, RMSE</w:t>
+              <w:t>Available locally</w:t>
             </w:r>
           </w:p>
         </w:tc>
@@ -455,7 +521,7 @@
           </w:tcPr>
           <w:p>
             <w:r>
-              <w:t>eTable 7. Nonparametric terms</w:t>
+              <w:t>eTable 7. Nonparametric smooth terms</w:t>
             </w:r>
           </w:p>
         </w:tc>
@@ -471,7 +537,7 @@
           </w:tcPr>
           <w:p>
             <w:r>
-              <w:t>`results/supplemental_etables/supplemental_etable7_nonparametric_terms_co2_rso2.csv` and `Supplemental_eTables6_8_CO2_rSO2.xlsx`</w:t>
+              <w:t>Supports the nonlinear EtCO2-rSO2 claim and other smooth covariate adjustments.</w:t>
             </w:r>
           </w:p>
         </w:tc>
@@ -487,7 +553,7 @@
           </w:tcPr>
           <w:p>
             <w:r>
-              <w:t>available locally</w:t>
+              <w:t>Outcome, smooth term, effective degrees of freedom, test statistic, p value.</w:t>
             </w:r>
           </w:p>
         </w:tc>
@@ -503,7 +569,7 @@
           </w:tcPr>
           <w:p>
             <w:r>
-              <w:t>Includes EtCO2 EDF and p values</w:t>
+              <w:t>Available locally</w:t>
             </w:r>
           </w:p>
         </w:tc>
@@ -521,7 +587,7 @@
           </w:tcPr>
           <w:p>
             <w:r>
-              <w:t>eTable 8. Parametric terms</w:t>
+              <w:t>eTable 8. Parametric covariate terms</w:t>
             </w:r>
           </w:p>
         </w:tc>
@@ -537,7 +603,7 @@
           </w:tcPr>
           <w:p>
             <w:r>
-              <w:t>`results/supplemental_etables/supplemental_etable8_parametric_terms_co2_rso2.csv` and `Supplemental_eTables6_8_CO2_rSO2.xlsx`</w:t>
+              <w:t>Documents patient-level covariate terms included in the models.</w:t>
             </w:r>
           </w:p>
         </w:tc>
@@ -553,7 +619,7 @@
           </w:tcPr>
           <w:p>
             <w:r>
-              <w:t>available locally</w:t>
+              <w:t>Outcome, covariate, estimate, standard error or interval, p value.</w:t>
             </w:r>
           </w:p>
         </w:tc>
@@ -569,7 +635,73 @@
           </w:tcPr>
           <w:p>
             <w:r>
-              <w:t>Includes categorical patient-level covariate terms</w:t>
+              <w:t>Available locally</w:t>
+            </w:r>
+          </w:p>
+        </w:tc>
+      </w:tr>
+      <w:tr>
+        <w:tc>
+          <w:tcPr>
+            <w:tcW w:type="dxa" w:w="2340"/>
+            <w:tcMar>
+              <w:top w:w="80" w:type="dxa"/>
+              <w:start w:w="120" w:type="dxa"/>
+              <w:bottom w:w="80" w:type="dxa"/>
+              <w:end w:w="120" w:type="dxa"/>
+            </w:tcMar>
+          </w:tcPr>
+          <w:p>
+            <w:r>
+              <w:t>eTable 9. Sensitivity analyses</w:t>
+            </w:r>
+          </w:p>
+        </w:tc>
+        <w:tc>
+          <w:tcPr>
+            <w:tcW w:type="dxa" w:w="2340"/>
+            <w:tcMar>
+              <w:top w:w="80" w:type="dxa"/>
+              <w:start w:w="120" w:type="dxa"/>
+              <w:bottom w:w="80" w:type="dxa"/>
+              <w:end w:w="120" w:type="dxa"/>
+            </w:tcMar>
+          </w:tcPr>
+          <w:p>
+            <w:r>
+              <w:t>Reserved for planned 5-model EtCO2 sensitivity analyses.</w:t>
+            </w:r>
+          </w:p>
+        </w:tc>
+        <w:tc>
+          <w:tcPr>
+            <w:tcW w:type="dxa" w:w="2340"/>
+            <w:tcMar>
+              <w:top w:w="80" w:type="dxa"/>
+              <w:start w:w="120" w:type="dxa"/>
+              <w:bottom w:w="80" w:type="dxa"/>
+              <w:end w:w="120" w:type="dxa"/>
+            </w:tcMar>
+          </w:tcPr>
+          <w:p>
+            <w:r>
+              <w:t>Outcome, model variant, EtCO2 contrast, 95% CI, status.</w:t>
+            </w:r>
+          </w:p>
+        </w:tc>
+        <w:tc>
+          <w:tcPr>
+            <w:tcW w:type="dxa" w:w="2340"/>
+            <w:tcMar>
+              <w:top w:w="80" w:type="dxa"/>
+              <w:start w:w="120" w:type="dxa"/>
+              <w:bottom w:w="80" w:type="dxa"/>
+              <w:end w:w="120" w:type="dxa"/>
+            </w:tcMar>
+          </w:tcPr>
+          <w:p>
+            <w:r>
+              <w:t>Not reported; planned result directories are missing</w:t>
             </w:r>
           </w:p>
         </w:tc>
@@ -581,7 +713,7 @@
         <w:pStyle w:val="Heading1"/>
       </w:pPr>
       <w:r>
-        <w:t>Main manuscript table candidates</w:t>
+        <w:t>Main Display Items Linked to the Supplement</w:t>
       </w:r>
     </w:p>
     <w:tbl>
@@ -611,7 +743,7 @@
           </w:tcPr>
           <w:p>
             <w:r>
-              <w:t>Display item</w:t>
+              <w:t>Main display</w:t>
             </w:r>
           </w:p>
         </w:tc>
@@ -628,7 +760,7 @@
           </w:tcPr>
           <w:p>
             <w:r>
-              <w:t>Source</w:t>
+              <w:t>Supplementary support</w:t>
             </w:r>
           </w:p>
         </w:tc>
@@ -645,7 +777,7 @@
           </w:tcPr>
           <w:p>
             <w:r>
-              <w:t>Recommendation</w:t>
+              <w:t>Review asset</w:t>
             </w:r>
           </w:p>
         </w:tc>
@@ -663,7 +795,7 @@
           </w:tcPr>
           <w:p>
             <w:r>
-              <w:t>Main Table 1</w:t>
+              <w:t>Table 1. Cohort characteristics</w:t>
             </w:r>
           </w:p>
         </w:tc>
@@ -679,7 +811,7 @@
           </w:tcPr>
           <w:p>
             <w:r>
-              <w:t>`docs/manuscript_development/generated_assets/table1_cohort_characteristics.xlsx`</w:t>
+              <w:t>eTables 1 and 2</w:t>
             </w:r>
           </w:p>
         </w:tc>
@@ -695,7 +827,7 @@
           </w:tcPr>
           <w:p>
             <w:r>
-              <w:t>Use concise patient/cohort characteristics in main manuscript; full baseline/intraoperative rows remain in supplementary eTable 1/2</w:t>
+              <w:t>Main Table 1 XLSX and CSV</w:t>
             </w:r>
           </w:p>
         </w:tc>
@@ -713,7 +845,7 @@
           </w:tcPr>
           <w:p>
             <w:r>
-              <w:t>Main Table 2</w:t>
+              <w:t>Table 2. Adjusted clinical-step contrasts</w:t>
             </w:r>
           </w:p>
         </w:tc>
@@ -729,7 +861,7 @@
           </w:tcPr>
           <w:p>
             <w:r>
-              <w:t>`docs/manuscript_development/generated_assets/table2_clinical_step_contrasts.xlsx`</w:t>
+              <w:t>eTables 6 and 7</w:t>
             </w:r>
           </w:p>
         </w:tc>
@@ -745,7 +877,7 @@
           </w:tcPr>
           <w:p>
             <w:r>
-              <w:t>Use as a compact clinical-step contrast table</w:t>
+              <w:t>Main Table 2 XLSX and CSV</w:t>
             </w:r>
           </w:p>
         </w:tc>
@@ -763,7 +895,7 @@
           </w:tcPr>
           <w:p>
             <w:r>
-              <w:t>Supplementary model diagnostics</w:t>
+              <w:t>Figure 1. Cohort assembly</w:t>
             </w:r>
           </w:p>
         </w:tc>
@@ -779,7 +911,7 @@
           </w:tcPr>
           <w:p>
             <w:r>
-              <w:t>`docs/manuscript_development/generated_assets/supplementary_model_diagnostics.xlsx`</w:t>
+              <w:t>eTable 1</w:t>
             </w:r>
           </w:p>
         </w:tc>
@@ -795,7 +927,157 @@
           </w:tcPr>
           <w:p>
             <w:r>
-              <w:t>Keep in supplement unless target journal wants model diagnostics in Methods</w:t>
+              <w:t>Figure 1 source CSV</w:t>
+            </w:r>
+          </w:p>
+        </w:tc>
+      </w:tr>
+      <w:tr>
+        <w:tc>
+          <w:tcPr>
+            <w:tcW w:type="dxa" w:w="3120"/>
+            <w:tcMar>
+              <w:top w:w="80" w:type="dxa"/>
+              <w:start w:w="120" w:type="dxa"/>
+              <w:bottom w:w="80" w:type="dxa"/>
+              <w:end w:w="120" w:type="dxa"/>
+            </w:tcMar>
+          </w:tcPr>
+          <w:p>
+            <w:r>
+              <w:t>Figure 2. Adjusted EtCO2-rSO2 curves</w:t>
+            </w:r>
+          </w:p>
+        </w:tc>
+        <w:tc>
+          <w:tcPr>
+            <w:tcW w:type="dxa" w:w="3120"/>
+            <w:tcMar>
+              <w:top w:w="80" w:type="dxa"/>
+              <w:start w:w="120" w:type="dxa"/>
+              <w:bottom w:w="80" w:type="dxa"/>
+              <w:end w:w="120" w:type="dxa"/>
+            </w:tcMar>
+          </w:tcPr>
+          <w:p>
+            <w:r>
+              <w:t>eTables 6 and 7</w:t>
+            </w:r>
+          </w:p>
+        </w:tc>
+        <w:tc>
+          <w:tcPr>
+            <w:tcW w:type="dxa" w:w="3120"/>
+            <w:tcMar>
+              <w:top w:w="80" w:type="dxa"/>
+              <w:start w:w="120" w:type="dxa"/>
+              <w:bottom w:w="80" w:type="dxa"/>
+              <w:end w:w="120" w:type="dxa"/>
+            </w:tcMar>
+          </w:tcPr>
+          <w:p>
+            <w:r>
+              <w:t>Figure 2 source CSV</w:t>
+            </w:r>
+          </w:p>
+        </w:tc>
+      </w:tr>
+      <w:tr>
+        <w:tc>
+          <w:tcPr>
+            <w:tcW w:type="dxa" w:w="3120"/>
+            <w:tcMar>
+              <w:top w:w="80" w:type="dxa"/>
+              <w:start w:w="120" w:type="dxa"/>
+              <w:bottom w:w="80" w:type="dxa"/>
+              <w:end w:w="120" w:type="dxa"/>
+            </w:tcMar>
+          </w:tcPr>
+          <w:p>
+            <w:r>
+              <w:t>Figure 3. Clinical-step contrasts</w:t>
+            </w:r>
+          </w:p>
+        </w:tc>
+        <w:tc>
+          <w:tcPr>
+            <w:tcW w:type="dxa" w:w="3120"/>
+            <w:tcMar>
+              <w:top w:w="80" w:type="dxa"/>
+              <w:start w:w="120" w:type="dxa"/>
+              <w:bottom w:w="80" w:type="dxa"/>
+              <w:end w:w="120" w:type="dxa"/>
+            </w:tcMar>
+          </w:tcPr>
+          <w:p>
+            <w:r>
+              <w:t>Table 2</w:t>
+            </w:r>
+          </w:p>
+        </w:tc>
+        <w:tc>
+          <w:tcPr>
+            <w:tcW w:type="dxa" w:w="3120"/>
+            <w:tcMar>
+              <w:top w:w="80" w:type="dxa"/>
+              <w:start w:w="120" w:type="dxa"/>
+              <w:bottom w:w="80" w:type="dxa"/>
+              <w:end w:w="120" w:type="dxa"/>
+            </w:tcMar>
+          </w:tcPr>
+          <w:p>
+            <w:r>
+              <w:t>Figure 3 source CSV</w:t>
+            </w:r>
+          </w:p>
+        </w:tc>
+      </w:tr>
+      <w:tr>
+        <w:tc>
+          <w:tcPr>
+            <w:tcW w:type="dxa" w:w="3120"/>
+            <w:tcMar>
+              <w:top w:w="80" w:type="dxa"/>
+              <w:start w:w="120" w:type="dxa"/>
+              <w:bottom w:w="80" w:type="dxa"/>
+              <w:end w:w="120" w:type="dxa"/>
+            </w:tcMar>
+          </w:tcPr>
+          <w:p>
+            <w:r>
+              <w:t>Figure 4. EtCO2 local slopes</w:t>
+            </w:r>
+          </w:p>
+        </w:tc>
+        <w:tc>
+          <w:tcPr>
+            <w:tcW w:type="dxa" w:w="3120"/>
+            <w:tcMar>
+              <w:top w:w="80" w:type="dxa"/>
+              <w:start w:w="120" w:type="dxa"/>
+              <w:bottom w:w="80" w:type="dxa"/>
+              <w:end w:w="120" w:type="dxa"/>
+            </w:tcMar>
+          </w:tcPr>
+          <w:p>
+            <w:r>
+              <w:t>eTable 7</w:t>
+            </w:r>
+          </w:p>
+        </w:tc>
+        <w:tc>
+          <w:tcPr>
+            <w:tcW w:type="dxa" w:w="3120"/>
+            <w:tcMar>
+              <w:top w:w="80" w:type="dxa"/>
+              <w:start w:w="120" w:type="dxa"/>
+              <w:bottom w:w="80" w:type="dxa"/>
+              <w:end w:w="120" w:type="dxa"/>
+            </w:tcMar>
+          </w:tcPr>
+          <w:p>
+            <w:r>
+              <w:t>Figure 4 source CSV</w:t>
             </w:r>
           </w:p>
         </w:tc>
@@ -807,7 +1089,7 @@
         <w:pStyle w:val="Heading1"/>
       </w:pPr>
       <w:r>
-        <w:t>Formatting TODO</w:t>
+        <w:t>Source Traceability</w:t>
       </w:r>
     </w:p>
     <w:p>
@@ -815,7 +1097,37 @@
         <w:pStyle w:val="ListBullet"/>
       </w:pPr>
       <w:r>
-        <w:t>Format all abbreviations consistently: EtCO2, FiO2, SctO2, SftO2, MAP, CI, SV, HR.</w:t>
+        <w:t xml:space="preserve">eTables 1 and 2: </w:t>
+      </w:r>
+      <w:r>
+        <w:rPr>
+          <w:rFonts w:ascii="Consolas" w:hAnsi="Consolas"/>
+          <w:sz w:val="20"/>
+        </w:rPr>
+        <w:t>docs/manuscript_development/generated_assets/supplementary_etable1_2_cohort_characteristics.xlsx</w:t>
+      </w:r>
+      <w:r>
+        <w:t xml:space="preserve">; </w:t>
+      </w:r>
+      <w:r>
+        <w:rPr>
+          <w:rFonts w:ascii="Consolas" w:hAnsi="Consolas"/>
+          <w:sz w:val="20"/>
+        </w:rPr>
+        <w:t>docs/manuscript_development/generated_assets/supplementary_etable1_2_cohort_characteristics_long.csv</w:t>
+      </w:r>
+      <w:r>
+        <w:t xml:space="preserve">; source files under </w:t>
+      </w:r>
+      <w:r>
+        <w:rPr>
+          <w:rFonts w:ascii="Consolas" w:hAnsi="Consolas"/>
+          <w:sz w:val="20"/>
+        </w:rPr>
+        <w:t>results/manuscript_tables/</w:t>
+      </w:r>
+      <w:r>
+        <w:t>.</w:t>
       </w:r>
     </w:p>
     <w:p>
@@ -823,7 +1135,27 @@
         <w:pStyle w:val="ListBullet"/>
       </w:pPr>
       <w:r>
-        <w:t>Replace repository paths with journal-facing supplement captions before submission.</w:t>
+        <w:t xml:space="preserve">eTables 3-5: </w:t>
+      </w:r>
+      <w:r>
+        <w:rPr>
+          <w:rFonts w:ascii="Consolas" w:hAnsi="Consolas"/>
+          <w:sz w:val="20"/>
+        </w:rPr>
+        <w:t>results/supplemental_etables/Supplemental_eTables3_5_CO2_rSO2.xlsx</w:t>
+      </w:r>
+      <w:r>
+        <w:t xml:space="preserve"> and corresponding CSV files in </w:t>
+      </w:r>
+      <w:r>
+        <w:rPr>
+          <w:rFonts w:ascii="Consolas" w:hAnsi="Consolas"/>
+          <w:sz w:val="20"/>
+        </w:rPr>
+        <w:t>results/supplemental_etables/</w:t>
+      </w:r>
+      <w:r>
+        <w:t>.</w:t>
       </w:r>
     </w:p>
     <w:p>
@@ -831,17 +1163,107 @@
         <w:pStyle w:val="ListBullet"/>
       </w:pPr>
       <w:r>
-        <w:t xml:space="preserve">No sensitivity-analysis table is included in the current evidence package because the planned result directories are unavailable; see </w:t>
+        <w:t xml:space="preserve">eTables 6-8: </w:t>
       </w:r>
       <w:r>
         <w:rPr>
           <w:rFonts w:ascii="Consolas" w:hAnsi="Consolas"/>
           <w:sz w:val="20"/>
         </w:rPr>
-        <w:t>CO2_SENSITIVITY_DECISION.md</w:t>
+        <w:t>results/supplemental_etables/Supplemental_eTables6_8_CO2_rSO2.xlsx</w:t>
+      </w:r>
+      <w:r>
+        <w:t xml:space="preserve"> and corresponding CSV files in </w:t>
+      </w:r>
+      <w:r>
+        <w:rPr>
+          <w:rFonts w:ascii="Consolas" w:hAnsi="Consolas"/>
+          <w:sz w:val="20"/>
+        </w:rPr>
+        <w:t>results/supplemental_etables/</w:t>
       </w:r>
       <w:r>
         <w:t>.</w:t>
+      </w:r>
+    </w:p>
+    <w:p>
+      <w:pPr>
+        <w:pStyle w:val="ListBullet"/>
+      </w:pPr>
+      <w:r>
+        <w:t xml:space="preserve">Main manuscript tables and source data: </w:t>
+      </w:r>
+      <w:r>
+        <w:rPr>
+          <w:rFonts w:ascii="Consolas" w:hAnsi="Consolas"/>
+          <w:sz w:val="20"/>
+        </w:rPr>
+        <w:t>docs/manuscript_development/generated_assets/</w:t>
+      </w:r>
+      <w:r>
+        <w:t>.</w:t>
+      </w:r>
+    </w:p>
+    <w:p>
+      <w:pPr>
+        <w:pStyle w:val="Heading1"/>
+      </w:pPr>
+      <w:r>
+        <w:t>Terminology and Formatting Notes</w:t>
+      </w:r>
+    </w:p>
+    <w:p>
+      <w:pPr>
+        <w:pStyle w:val="ListBullet"/>
+      </w:pPr>
+      <w:r>
+        <w:t>Use EtCO2 for end-tidal carbon dioxide.</w:t>
+      </w:r>
+    </w:p>
+    <w:p>
+      <w:pPr>
+        <w:pStyle w:val="ListBullet"/>
+      </w:pPr>
+      <w:r>
+        <w:t>Use SctO2 for cerebral tissue oxygen saturation and SftO2 for forearm tissue oxygen saturation.</w:t>
+      </w:r>
+    </w:p>
+    <w:p>
+      <w:pPr>
+        <w:pStyle w:val="ListBullet"/>
+      </w:pPr>
+      <w:r>
+        <w:t xml:space="preserve">Report </w:t>
+      </w:r>
+      <w:r>
+        <w:rPr>
+          <w:rFonts w:ascii="Consolas" w:hAnsi="Consolas"/>
+          <w:sz w:val="20"/>
+        </w:rPr>
+        <w:t>rSO2_Ch1</w:t>
+      </w:r>
+      <w:r>
+        <w:t xml:space="preserve"> as left SctO2, </w:t>
+      </w:r>
+      <w:r>
+        <w:rPr>
+          <w:rFonts w:ascii="Consolas" w:hAnsi="Consolas"/>
+          <w:sz w:val="20"/>
+        </w:rPr>
+        <w:t>rSO2_Ch2</w:t>
+      </w:r>
+      <w:r>
+        <w:t xml:space="preserve"> as right SctO2, and </w:t>
+      </w:r>
+      <w:r>
+        <w:rPr>
+          <w:rFonts w:ascii="Consolas" w:hAnsi="Consolas"/>
+          <w:sz w:val="20"/>
+        </w:rPr>
+        <w:t>rSO2_Ch3</w:t>
+      </w:r>
+      <w:r>
+        <w:t xml:space="preserve"> as SftO2.</w:t>
       </w:r>
     </w:p>
     <w:p>
@@ -859,7 +1281,7 @@
         <w:t>Male, n (%)</w:t>
       </w:r>
       <w:r>
-        <w:t xml:space="preserve"> in manuscript-facing table assets; see </w:t>
+        <w:t xml:space="preserve"> in manuscript-facing assets; see </w:t>
       </w:r>
       <w:r>
         <w:rPr>
@@ -867,6 +1289,34 @@
           <w:sz w:val="20"/>
         </w:rPr>
         <w:t>CO2_SEX_LABEL_AUDIT.md</w:t>
+      </w:r>
+      <w:r>
+        <w:t>.</w:t>
+      </w:r>
+    </w:p>
+    <w:p>
+      <w:pPr>
+        <w:pStyle w:val="ListBullet"/>
+      </w:pPr>
+      <w:r>
+        <w:t xml:space="preserve">No sensitivity-analysis table is included in the current evidence package because all planned sensitivity result directories are marked as </w:t>
+      </w:r>
+      <w:r>
+        <w:rPr>
+          <w:rFonts w:ascii="Consolas" w:hAnsi="Consolas"/>
+          <w:sz w:val="20"/>
+        </w:rPr>
+        <w:t>missing_result_dir</w:t>
+      </w:r>
+      <w:r>
+        <w:t xml:space="preserve">; see </w:t>
+      </w:r>
+      <w:r>
+        <w:rPr>
+          <w:rFonts w:ascii="Consolas" w:hAnsi="Consolas"/>
+          <w:sz w:val="20"/>
+        </w:rPr>
+        <w:t>CO2_SENSITIVITY_DECISION.md</w:t>
       </w:r>
       <w:r>
         <w:t>.</w:t>

</xml_diff>